<commit_message>
feat: add college & ACM branding, social handles, hosting guide, and doc updates
</commit_message>
<xml_diff>
--- a/CODE100_Comprehensive_Software_Documentation.docx
+++ b/CODE100_Comprehensive_Software_Documentation.docx
@@ -2,47 +2,172 @@
 <file path=word/document.xml><?xml version="1.0" encoding="utf-8"?>
 <w:document xmlns:wpc="http://schemas.microsoft.com/office/word/2010/wordprocessingCanvas" xmlns:mo="http://schemas.microsoft.com/office/mac/office/2008/main" xmlns:mc="http://schemas.openxmlformats.org/markup-compatibility/2006" xmlns:mv="urn:schemas-microsoft-com:mac:vml" xmlns:o="urn:schemas-microsoft-com:office:office" xmlns:r="http://schemas.openxmlformats.org/officeDocument/2006/relationships" xmlns:m="http://schemas.openxmlformats.org/officeDocument/2006/math" xmlns:v="urn:schemas-microsoft-com:vml" xmlns:wp14="http://schemas.microsoft.com/office/word/2010/wordprocessingDrawing" xmlns:wp="http://schemas.openxmlformats.org/drawingml/2006/wordprocessingDrawing" xmlns:w10="urn:schemas-microsoft-com:office:word" xmlns:w="http://schemas.openxmlformats.org/wordprocessingml/2006/main" xmlns:w14="http://schemas.microsoft.com/office/word/2010/wordml" xmlns:wpg="http://schemas.microsoft.com/office/word/2010/wordprocessingGroup" xmlns:wpi="http://schemas.microsoft.com/office/word/2010/wordprocessingInk" xmlns:wne="http://schemas.microsoft.com/office/word/2006/wordml" xmlns:wps="http://schemas.microsoft.com/office/word/2010/wordprocessingShape" mc:Ignorable="w14 wp14">
   <w:body>
+    <w:tbl>
+      <w:tblPr>
+        <w:tblW w:type="auto" w:w="0"/>
+        <w:jc w:val="center"/>
+        <w:tblLook w:firstColumn="1" w:firstRow="1" w:lastColumn="0" w:lastRow="0" w:noHBand="0" w:noVBand="1" w:val="04A0"/>
+      </w:tblPr>
+      <w:tblGrid>
+        <w:gridCol w:w="3120"/>
+        <w:gridCol w:w="3120"/>
+        <w:gridCol w:w="3120"/>
+      </w:tblGrid>
+      <w:tr>
+        <w:tc>
+          <w:tcPr>
+            <w:tcW w:type="dxa" w:w="2592"/>
+            <w:tcBorders>
+              <w:top w:val="none"/>
+              <w:left w:val="none"/>
+              <w:bottom w:val="none"/>
+              <w:right w:val="none"/>
+            </w:tcBorders>
+          </w:tcPr>
+          <w:p>
+            <w:pPr>
+              <w:jc w:val="left"/>
+            </w:pPr>
+            <w:r>
+              <w:drawing>
+                <wp:inline xmlns:a="http://schemas.openxmlformats.org/drawingml/2006/main" xmlns:pic="http://schemas.openxmlformats.org/drawingml/2006/picture">
+                  <wp:extent cx="1508760" cy="1063058"/>
+                  <wp:docPr id="1" name="Picture 1"/>
+                  <wp:cNvGraphicFramePr>
+                    <a:graphicFrameLocks noChangeAspect="1"/>
+                  </wp:cNvGraphicFramePr>
+                  <a:graphic>
+                    <a:graphicData uri="http://schemas.openxmlformats.org/drawingml/2006/picture">
+                      <pic:pic>
+                        <pic:nvPicPr>
+                          <pic:cNvPr id="0" name="college_logo_clean.png"/>
+                          <pic:cNvPicPr/>
+                        </pic:nvPicPr>
+                        <pic:blipFill>
+                          <a:blip r:embed="rId9"/>
+                          <a:stretch>
+                            <a:fillRect/>
+                          </a:stretch>
+                        </pic:blipFill>
+                        <pic:spPr>
+                          <a:xfrm>
+                            <a:off x="0" y="0"/>
+                            <a:ext cx="1508760" cy="1063058"/>
+                          </a:xfrm>
+                          <a:prstGeom prst="rect"/>
+                        </pic:spPr>
+                      </pic:pic>
+                    </a:graphicData>
+                  </a:graphic>
+                </wp:inline>
+              </w:drawing>
+            </w:r>
+          </w:p>
+        </w:tc>
+        <w:tc>
+          <w:tcPr>
+            <w:tcW w:type="dxa" w:w="4608"/>
+            <w:tcBorders>
+              <w:top w:val="none"/>
+              <w:left w:val="none"/>
+              <w:bottom w:val="none"/>
+              <w:right w:val="none"/>
+            </w:tcBorders>
+          </w:tcPr>
+          <w:p>
+            <w:pPr>
+              <w:spacing w:before="80" w:after="40"/>
+              <w:jc w:val="center"/>
+            </w:pPr>
+            <w:r>
+              <w:rPr>
+                <w:rFonts w:ascii="Calibri" w:hAnsi="Calibri"/>
+                <w:b/>
+                <w:color w:val="9E1B32"/>
+                <w:sz w:val="22"/>
+              </w:rPr>
+              <w:t>GLOBAL ACADEMY OF TECHNOLOGY</w:t>
+              <w:br/>
+              <w:t>ACM STUDENT CHAPTER</w:t>
+              <w:br/>
+            </w:r>
+            <w:r>
+              <w:rPr>
+                <w:rFonts w:ascii="Calibri" w:hAnsi="Calibri"/>
+                <w:b/>
+                <w:color w:val="1E293B"/>
+                <w:sz w:val="30"/>
+              </w:rPr>
+              <w:t>CODE100 — 100 Days of DSA Platform</w:t>
+              <w:br/>
+            </w:r>
+            <w:r>
+              <w:rPr>
+                <w:rFonts w:ascii="Calibri" w:hAnsi="Calibri"/>
+                <w:i/>
+                <w:color w:val="64748B"/>
+                <w:sz w:val="19"/>
+              </w:rPr>
+              <w:t>Comprehensive Technical Specifications &amp; Operations Manual</w:t>
+            </w:r>
+          </w:p>
+        </w:tc>
+        <w:tc>
+          <w:tcPr>
+            <w:tcW w:type="dxa" w:w="2592"/>
+            <w:tcBorders>
+              <w:top w:val="none"/>
+              <w:left w:val="none"/>
+              <w:bottom w:val="none"/>
+              <w:right w:val="none"/>
+            </w:tcBorders>
+          </w:tcPr>
+          <w:p>
+            <w:pPr>
+              <w:jc w:val="right"/>
+            </w:pPr>
+            <w:r>
+              <w:drawing>
+                <wp:inline xmlns:a="http://schemas.openxmlformats.org/drawingml/2006/main" xmlns:pic="http://schemas.openxmlformats.org/drawingml/2006/picture">
+                  <wp:extent cx="1508760" cy="845375"/>
+                  <wp:docPr id="2" name="Picture 2"/>
+                  <wp:cNvGraphicFramePr>
+                    <a:graphicFrameLocks noChangeAspect="1"/>
+                  </wp:cNvGraphicFramePr>
+                  <a:graphic>
+                    <a:graphicData uri="http://schemas.openxmlformats.org/drawingml/2006/picture">
+                      <pic:pic>
+                        <pic:nvPicPr>
+                          <pic:cNvPr id="0" name="acm_logo_clean.png"/>
+                          <pic:cNvPicPr/>
+                        </pic:nvPicPr>
+                        <pic:blipFill>
+                          <a:blip r:embed="rId10"/>
+                          <a:stretch>
+                            <a:fillRect/>
+                          </a:stretch>
+                        </pic:blipFill>
+                        <pic:spPr>
+                          <a:xfrm>
+                            <a:off x="0" y="0"/>
+                            <a:ext cx="1508760" cy="845375"/>
+                          </a:xfrm>
+                          <a:prstGeom prst="rect"/>
+                        </pic:spPr>
+                      </pic:pic>
+                    </a:graphicData>
+                  </a:graphic>
+                </wp:inline>
+              </w:drawing>
+            </w:r>
+          </w:p>
+        </w:tc>
+      </w:tr>
+    </w:tbl>
     <w:p>
       <w:pPr>
-        <w:spacing w:before="0" w:after="40"/>
+        <w:spacing w:after="200"/>
       </w:pPr>
-      <w:r>
-        <w:rPr>
-          <w:rFonts w:ascii="Calibri" w:hAnsi="Calibri"/>
-          <w:b/>
-          <w:color w:val="9E1B32"/>
-          <w:sz w:val="22"/>
-        </w:rPr>
-        <w:t>GLOBAL ACADEMY OF TECHNOLOGY — ACM STUDENT CHAPTER</w:t>
-      </w:r>
-    </w:p>
-    <w:p>
-      <w:pPr>
-        <w:spacing w:before="80" w:after="80"/>
-      </w:pPr>
-      <w:r>
-        <w:rPr>
-          <w:rFonts w:ascii="Calibri" w:hAnsi="Calibri"/>
-          <w:b/>
-          <w:color w:val="1E293B"/>
-          <w:sz w:val="48"/>
-        </w:rPr>
-        <w:t>CODE100 — 100 Days of DSA Platform</w:t>
-      </w:r>
-    </w:p>
-    <w:p>
-      <w:pPr>
-        <w:spacing w:before="0" w:after="280"/>
-      </w:pPr>
-      <w:r>
-        <w:rPr>
-          <w:rFonts w:ascii="Calibri" w:hAnsi="Calibri"/>
-          <w:i/>
-          <w:color w:val="64748B"/>
-          <w:sz w:val="26"/>
-        </w:rPr>
-        <w:t>Comprehensive Software Architecture, Technical Specifications, Anti-Cheat Verification, &amp; Operations Manual</w:t>
-      </w:r>
     </w:p>
     <w:tbl>
       <w:tblPr>
@@ -3053,7 +3178,7 @@
           <w:color w:val="1E293B"/>
           <w:sz w:val="32"/>
         </w:rPr>
-        <w:t>Deployment, Operations, &amp; Maintenance</w:t>
+        <w:t>Hosting, Deployment, &amp; Cloud Infrastructure</w:t>
       </w:r>
     </w:p>
     <w:p>
@@ -3066,7 +3191,7 @@
           <w:color w:val="1E293B"/>
           <w:sz w:val="21"/>
         </w:rPr>
-        <w:t>The application is configured for deployment on institutional infrastructure or cloud hosting platforms:</w:t>
+        <w:t>This section details the hosting architectures for CODE100 across $0 free tiers, institutional deployments, and high-concurrency production setups.</w:t>
       </w:r>
     </w:p>
     <w:p>
@@ -3081,7 +3206,20 @@
           <w:color w:val="9E1B32"/>
           <w:sz w:val="24"/>
         </w:rPr>
-        <w:t>Deployment Instructions</w:t>
+        <w:t>A. $0 Free-Tier Architecture (Vercel + Supabase / Neon)</w:t>
+      </w:r>
+    </w:p>
+    <w:p>
+      <w:pPr>
+        <w:spacing w:after="80" w:line="276" w:lineRule="auto"/>
+      </w:pPr>
+      <w:r>
+        <w:rPr>
+          <w:rFonts w:ascii="Calibri" w:hAnsi="Calibri"/>
+          <w:color w:val="1E293B"/>
+          <w:sz w:val="21"/>
+        </w:rPr>
+        <w:t>For a 100-day college event with 500 to 1,000 registered students, CODE100 can run at zero infrastructure cost ($0):</w:t>
       </w:r>
     </w:p>
     <w:p>
@@ -3096,7 +3234,7 @@
           <w:color w:val="1E293B"/>
           <w:sz w:val="20"/>
         </w:rPr>
-        <w:t>1. Prerequisites:</w:t>
+        <w:t>Frontend &amp; API (Vercel Hobby):</w:t>
       </w:r>
       <w:r>
         <w:rPr>
@@ -3104,7 +3242,7 @@
           <w:color w:val="1E293B"/>
           <w:sz w:val="20"/>
         </w:rPr>
-        <w:t>Ensure Node.js 20+ or 22+ LTS is installed.</w:t>
+        <w:t>Next.js App Router deployed with automatic edge caching, SSL, and instant Git rollbacks.</w:t>
       </w:r>
     </w:p>
     <w:p>
@@ -3119,7 +3257,7 @@
           <w:color w:val="1E293B"/>
           <w:sz w:val="20"/>
         </w:rPr>
-        <w:t>2. Dependency Installation:</w:t>
+        <w:t>Database (Supabase / Neon Free):</w:t>
       </w:r>
       <w:r>
         <w:rPr>
@@ -3127,7 +3265,7 @@
           <w:color w:val="1E293B"/>
           <w:sz w:val="20"/>
         </w:rPr>
-        <w:t>Run `npm install` to install all production and development dependencies.</w:t>
+        <w:t>Hosted PostgreSQL with connection pooling (PgBouncer/Supavisor, port 6543) preventing connection exhaustion from serverless functions.</w:t>
       </w:r>
     </w:p>
     <w:p>
@@ -3142,7 +3280,7 @@
           <w:color w:val="1E293B"/>
           <w:sz w:val="20"/>
         </w:rPr>
-        <w:t>3. Environment Setup:</w:t>
+        <w:t>Authentication:</w:t>
       </w:r>
       <w:r>
         <w:rPr>
@@ -3150,7 +3288,7 @@
           <w:color w:val="1E293B"/>
           <w:sz w:val="20"/>
         </w:rPr>
-        <w:t>Configure `.env` with `DATABASE_URL` (SQLite for local/test, PostgreSQL for production) and `AUTH_SECRET`.</w:t>
+        <w:t>Stateless Jose JWT authentication enclosed in HttpOnly cookies, requiring zero external auth server dependencies.</w:t>
       </w:r>
     </w:p>
     <w:p>
@@ -3165,7 +3303,7 @@
           <w:color w:val="1E293B"/>
           <w:sz w:val="20"/>
         </w:rPr>
-        <w:t>4. Database Initialization:</w:t>
+        <w:t>Domain &amp; SSL:</w:t>
       </w:r>
       <w:r>
         <w:rPr>
@@ -3173,7 +3311,599 @@
           <w:color w:val="1E293B"/>
           <w:sz w:val="20"/>
         </w:rPr>
-        <w:t>Execute `npx prisma db push` and `npx tsx prisma/seed.ts` to initialize the database and 100 curated challenges.</w:t>
+        <w:t>Vercel default subdomain (code100.vercel.app) or an institutional college subdomain (code100.gat.ac.in via CNAME) with automated Let's Encrypt certificates.</w:t>
+      </w:r>
+    </w:p>
+    <w:p>
+      <w:pPr>
+        <w:keepNext/>
+        <w:spacing w:before="240" w:after="40"/>
+      </w:pPr>
+      <w:r>
+        <w:rPr>
+          <w:rFonts w:ascii="Calibri" w:hAnsi="Calibri"/>
+          <w:b/>
+          <w:color w:val="9E1B32"/>
+          <w:sz w:val="24"/>
+        </w:rPr>
+        <w:t>B. Hosting Provider Evaluation Matrix</w:t>
+      </w:r>
+    </w:p>
+    <w:tbl>
+      <w:tblPr>
+        <w:tblW w:type="auto" w:w="0"/>
+        <w:jc w:val="center"/>
+        <w:tblLook w:firstColumn="1" w:firstRow="1" w:lastColumn="0" w:lastRow="0" w:noHBand="0" w:noVBand="1" w:val="04A0"/>
+      </w:tblPr>
+      <w:tblGrid>
+        <w:gridCol w:w="2340"/>
+        <w:gridCol w:w="2340"/>
+        <w:gridCol w:w="2340"/>
+        <w:gridCol w:w="2340"/>
+      </w:tblGrid>
+      <w:tr>
+        <w:tc>
+          <w:tcPr>
+            <w:tcW w:type="dxa" w:w="2340"/>
+            <w:shd w:fill="1E293B"/>
+            <w:tcMar>
+              <w:top w:w="80" w:type="dxa"/>
+              <w:bottom w:w="80" w:type="dxa"/>
+              <w:left w:w="80" w:type="dxa"/>
+              <w:right w:w="80" w:type="dxa"/>
+            </w:tcMar>
+          </w:tcPr>
+          <w:p>
+            <w:r>
+              <w:rPr>
+                <w:rFonts w:ascii="Calibri" w:hAnsi="Calibri"/>
+                <w:b/>
+                <w:color w:val="FFFFFF"/>
+                <w:sz w:val="19"/>
+              </w:rPr>
+              <w:t>Provider</w:t>
+            </w:r>
+          </w:p>
+        </w:tc>
+        <w:tc>
+          <w:tcPr>
+            <w:tcW w:type="dxa" w:w="2340"/>
+            <w:shd w:fill="1E293B"/>
+            <w:tcMar>
+              <w:top w:w="80" w:type="dxa"/>
+              <w:bottom w:w="80" w:type="dxa"/>
+              <w:left w:w="80" w:type="dxa"/>
+              <w:right w:w="80" w:type="dxa"/>
+            </w:tcMar>
+          </w:tcPr>
+          <w:p>
+            <w:r>
+              <w:rPr>
+                <w:rFonts w:ascii="Calibri" w:hAnsi="Calibri"/>
+                <w:b/>
+                <w:color w:val="FFFFFF"/>
+                <w:sz w:val="19"/>
+              </w:rPr>
+              <w:t>Plan / Cost</w:t>
+            </w:r>
+          </w:p>
+        </w:tc>
+        <w:tc>
+          <w:tcPr>
+            <w:tcW w:type="dxa" w:w="2340"/>
+            <w:shd w:fill="1E293B"/>
+            <w:tcMar>
+              <w:top w:w="80" w:type="dxa"/>
+              <w:bottom w:w="80" w:type="dxa"/>
+              <w:left w:w="80" w:type="dxa"/>
+              <w:right w:w="80" w:type="dxa"/>
+            </w:tcMar>
+          </w:tcPr>
+          <w:p>
+            <w:r>
+              <w:rPr>
+                <w:rFonts w:ascii="Calibri" w:hAnsi="Calibri"/>
+                <w:b/>
+                <w:color w:val="FFFFFF"/>
+                <w:sz w:val="19"/>
+              </w:rPr>
+              <w:t>Database Support</w:t>
+            </w:r>
+          </w:p>
+        </w:tc>
+        <w:tc>
+          <w:tcPr>
+            <w:tcW w:type="dxa" w:w="2340"/>
+            <w:shd w:fill="1E293B"/>
+            <w:tcMar>
+              <w:top w:w="80" w:type="dxa"/>
+              <w:bottom w:w="80" w:type="dxa"/>
+              <w:left w:w="80" w:type="dxa"/>
+              <w:right w:w="80" w:type="dxa"/>
+            </w:tcMar>
+          </w:tcPr>
+          <w:p>
+            <w:r>
+              <w:rPr>
+                <w:rFonts w:ascii="Calibri" w:hAnsi="Calibri"/>
+                <w:b/>
+                <w:color w:val="FFFFFF"/>
+                <w:sz w:val="19"/>
+              </w:rPr>
+              <w:t>Suitability for CODE100</w:t>
+            </w:r>
+          </w:p>
+        </w:tc>
+      </w:tr>
+      <w:tr>
+        <w:tc>
+          <w:tcPr>
+            <w:tcW w:type="dxa" w:w="2340"/>
+            <w:shd w:fill="F8FAFC"/>
+            <w:tcMar>
+              <w:top w:w="70" w:type="dxa"/>
+              <w:bottom w:w="70" w:type="dxa"/>
+              <w:left w:w="70" w:type="dxa"/>
+              <w:right w:w="70" w:type="dxa"/>
+            </w:tcMar>
+          </w:tcPr>
+          <w:p>
+            <w:r>
+              <w:rPr>
+                <w:rFonts w:ascii="Calibri" w:hAnsi="Calibri"/>
+                <w:color w:val="1E293B"/>
+                <w:sz w:val="17"/>
+              </w:rPr>
+              <w:t>Vercel</w:t>
+            </w:r>
+          </w:p>
+        </w:tc>
+        <w:tc>
+          <w:tcPr>
+            <w:tcW w:type="dxa" w:w="2340"/>
+            <w:shd w:fill="F8FAFC"/>
+            <w:tcMar>
+              <w:top w:w="70" w:type="dxa"/>
+              <w:bottom w:w="70" w:type="dxa"/>
+              <w:left w:w="70" w:type="dxa"/>
+              <w:right w:w="70" w:type="dxa"/>
+            </w:tcMar>
+          </w:tcPr>
+          <w:p>
+            <w:r>
+              <w:rPr>
+                <w:rFonts w:ascii="Calibri" w:hAnsi="Calibri"/>
+                <w:color w:val="1E293B"/>
+                <w:sz w:val="17"/>
+              </w:rPr>
+              <w:t>Hobby ($0) / Pro ($20/mo)</w:t>
+            </w:r>
+          </w:p>
+        </w:tc>
+        <w:tc>
+          <w:tcPr>
+            <w:tcW w:type="dxa" w:w="2340"/>
+            <w:shd w:fill="F8FAFC"/>
+            <w:tcMar>
+              <w:top w:w="70" w:type="dxa"/>
+              <w:bottom w:w="70" w:type="dxa"/>
+              <w:left w:w="70" w:type="dxa"/>
+              <w:right w:w="70" w:type="dxa"/>
+            </w:tcMar>
+          </w:tcPr>
+          <w:p>
+            <w:r>
+              <w:rPr>
+                <w:rFonts w:ascii="Calibri" w:hAnsi="Calibri"/>
+                <w:color w:val="1E293B"/>
+                <w:sz w:val="17"/>
+              </w:rPr>
+              <w:t>External DB (Supabase / Neon)</w:t>
+            </w:r>
+          </w:p>
+        </w:tc>
+        <w:tc>
+          <w:tcPr>
+            <w:tcW w:type="dxa" w:w="2340"/>
+            <w:shd w:fill="F8FAFC"/>
+            <w:tcMar>
+              <w:top w:w="70" w:type="dxa"/>
+              <w:bottom w:w="70" w:type="dxa"/>
+              <w:left w:w="70" w:type="dxa"/>
+              <w:right w:w="70" w:type="dxa"/>
+            </w:tcMar>
+          </w:tcPr>
+          <w:p>
+            <w:r>
+              <w:rPr>
+                <w:rFonts w:ascii="Calibri" w:hAnsi="Calibri"/>
+                <w:color w:val="1E293B"/>
+                <w:sz w:val="17"/>
+              </w:rPr>
+              <w:t>Recommended for Next.js App Router; instant preview builds &amp; automated edge scaling.</w:t>
+            </w:r>
+          </w:p>
+        </w:tc>
+      </w:tr>
+      <w:tr>
+        <w:tc>
+          <w:tcPr>
+            <w:tcW w:type="dxa" w:w="2340"/>
+            <w:shd w:fill="FFFFFF"/>
+            <w:tcMar>
+              <w:top w:w="70" w:type="dxa"/>
+              <w:bottom w:w="70" w:type="dxa"/>
+              <w:left w:w="70" w:type="dxa"/>
+              <w:right w:w="70" w:type="dxa"/>
+            </w:tcMar>
+          </w:tcPr>
+          <w:p>
+            <w:r>
+              <w:rPr>
+                <w:rFonts w:ascii="Calibri" w:hAnsi="Calibri"/>
+                <w:color w:val="1E293B"/>
+                <w:sz w:val="17"/>
+              </w:rPr>
+              <w:t>Render</w:t>
+            </w:r>
+          </w:p>
+        </w:tc>
+        <w:tc>
+          <w:tcPr>
+            <w:tcW w:type="dxa" w:w="2340"/>
+            <w:shd w:fill="FFFFFF"/>
+            <w:tcMar>
+              <w:top w:w="70" w:type="dxa"/>
+              <w:bottom w:w="70" w:type="dxa"/>
+              <w:left w:w="70" w:type="dxa"/>
+              <w:right w:w="70" w:type="dxa"/>
+            </w:tcMar>
+          </w:tcPr>
+          <w:p>
+            <w:r>
+              <w:rPr>
+                <w:rFonts w:ascii="Calibri" w:hAnsi="Calibri"/>
+                <w:color w:val="1E293B"/>
+                <w:sz w:val="17"/>
+              </w:rPr>
+              <w:t>Free Web Service / Starter ($7/mo)</w:t>
+            </w:r>
+          </w:p>
+        </w:tc>
+        <w:tc>
+          <w:tcPr>
+            <w:tcW w:type="dxa" w:w="2340"/>
+            <w:shd w:fill="FFFFFF"/>
+            <w:tcMar>
+              <w:top w:w="70" w:type="dxa"/>
+              <w:bottom w:w="70" w:type="dxa"/>
+              <w:left w:w="70" w:type="dxa"/>
+              <w:right w:w="70" w:type="dxa"/>
+            </w:tcMar>
+          </w:tcPr>
+          <w:p>
+            <w:r>
+              <w:rPr>
+                <w:rFonts w:ascii="Calibri" w:hAnsi="Calibri"/>
+                <w:color w:val="1E293B"/>
+                <w:sz w:val="17"/>
+              </w:rPr>
+              <w:t>Managed PostgreSQL ($0 for 30d, then $7/mo)</w:t>
+            </w:r>
+          </w:p>
+        </w:tc>
+        <w:tc>
+          <w:tcPr>
+            <w:tcW w:type="dxa" w:w="2340"/>
+            <w:shd w:fill="FFFFFF"/>
+            <w:tcMar>
+              <w:top w:w="70" w:type="dxa"/>
+              <w:bottom w:w="70" w:type="dxa"/>
+              <w:left w:w="70" w:type="dxa"/>
+              <w:right w:w="70" w:type="dxa"/>
+            </w:tcMar>
+          </w:tcPr>
+          <w:p>
+            <w:r>
+              <w:rPr>
+                <w:rFonts w:ascii="Calibri" w:hAnsi="Calibri"/>
+                <w:color w:val="1E293B"/>
+                <w:sz w:val="17"/>
+              </w:rPr>
+              <w:t>Good container option; free tier spins down after 15 minutes of inactivity.</w:t>
+            </w:r>
+          </w:p>
+        </w:tc>
+      </w:tr>
+      <w:tr>
+        <w:tc>
+          <w:tcPr>
+            <w:tcW w:type="dxa" w:w="2340"/>
+            <w:shd w:fill="F8FAFC"/>
+            <w:tcMar>
+              <w:top w:w="70" w:type="dxa"/>
+              <w:bottom w:w="70" w:type="dxa"/>
+              <w:left w:w="70" w:type="dxa"/>
+              <w:right w:w="70" w:type="dxa"/>
+            </w:tcMar>
+          </w:tcPr>
+          <w:p>
+            <w:r>
+              <w:rPr>
+                <w:rFonts w:ascii="Calibri" w:hAnsi="Calibri"/>
+                <w:color w:val="1E293B"/>
+                <w:sz w:val="17"/>
+              </w:rPr>
+              <w:t>Railway</w:t>
+            </w:r>
+          </w:p>
+        </w:tc>
+        <w:tc>
+          <w:tcPr>
+            <w:tcW w:type="dxa" w:w="2340"/>
+            <w:shd w:fill="F8FAFC"/>
+            <w:tcMar>
+              <w:top w:w="70" w:type="dxa"/>
+              <w:bottom w:w="70" w:type="dxa"/>
+              <w:left w:w="70" w:type="dxa"/>
+              <w:right w:w="70" w:type="dxa"/>
+            </w:tcMar>
+          </w:tcPr>
+          <w:p>
+            <w:r>
+              <w:rPr>
+                <w:rFonts w:ascii="Calibri" w:hAnsi="Calibri"/>
+                <w:color w:val="1E293B"/>
+                <w:sz w:val="17"/>
+              </w:rPr>
+              <w:t>Trial ($5 credit) / Usage-based</w:t>
+            </w:r>
+          </w:p>
+        </w:tc>
+        <w:tc>
+          <w:tcPr>
+            <w:tcW w:type="dxa" w:w="2340"/>
+            <w:shd w:fill="F8FAFC"/>
+            <w:tcMar>
+              <w:top w:w="70" w:type="dxa"/>
+              <w:bottom w:w="70" w:type="dxa"/>
+              <w:left w:w="70" w:type="dxa"/>
+              <w:right w:w="70" w:type="dxa"/>
+            </w:tcMar>
+          </w:tcPr>
+          <w:p>
+            <w:r>
+              <w:rPr>
+                <w:rFonts w:ascii="Calibri" w:hAnsi="Calibri"/>
+                <w:color w:val="1E293B"/>
+                <w:sz w:val="17"/>
+              </w:rPr>
+              <w:t>PostgreSQL plugin included</w:t>
+            </w:r>
+          </w:p>
+        </w:tc>
+        <w:tc>
+          <w:tcPr>
+            <w:tcW w:type="dxa" w:w="2340"/>
+            <w:shd w:fill="F8FAFC"/>
+            <w:tcMar>
+              <w:top w:w="70" w:type="dxa"/>
+              <w:bottom w:w="70" w:type="dxa"/>
+              <w:left w:w="70" w:type="dxa"/>
+              <w:right w:w="70" w:type="dxa"/>
+            </w:tcMar>
+          </w:tcPr>
+          <w:p>
+            <w:r>
+              <w:rPr>
+                <w:rFonts w:ascii="Calibri" w:hAnsi="Calibri"/>
+                <w:color w:val="1E293B"/>
+                <w:sz w:val="17"/>
+              </w:rPr>
+              <w:t>Excellent developer experience, but requires payment method after initial credits.</w:t>
+            </w:r>
+          </w:p>
+        </w:tc>
+      </w:tr>
+      <w:tr>
+        <w:tc>
+          <w:tcPr>
+            <w:tcW w:type="dxa" w:w="2340"/>
+            <w:shd w:fill="FFFFFF"/>
+            <w:tcMar>
+              <w:top w:w="70" w:type="dxa"/>
+              <w:bottom w:w="70" w:type="dxa"/>
+              <w:left w:w="70" w:type="dxa"/>
+              <w:right w:w="70" w:type="dxa"/>
+            </w:tcMar>
+          </w:tcPr>
+          <w:p>
+            <w:r>
+              <w:rPr>
+                <w:rFonts w:ascii="Calibri" w:hAnsi="Calibri"/>
+                <w:color w:val="1E293B"/>
+                <w:sz w:val="17"/>
+              </w:rPr>
+              <w:t>Self-Hosted VPS / College Lab</w:t>
+            </w:r>
+          </w:p>
+        </w:tc>
+        <w:tc>
+          <w:tcPr>
+            <w:tcW w:type="dxa" w:w="2340"/>
+            <w:shd w:fill="FFFFFF"/>
+            <w:tcMar>
+              <w:top w:w="70" w:type="dxa"/>
+              <w:bottom w:w="70" w:type="dxa"/>
+              <w:left w:w="70" w:type="dxa"/>
+              <w:right w:w="70" w:type="dxa"/>
+            </w:tcMar>
+          </w:tcPr>
+          <w:p>
+            <w:r>
+              <w:rPr>
+                <w:rFonts w:ascii="Calibri" w:hAnsi="Calibri"/>
+                <w:color w:val="1E293B"/>
+                <w:sz w:val="17"/>
+              </w:rPr>
+              <w:t>Hardware amortized ($0) or $5-$10/mo VPS</w:t>
+            </w:r>
+          </w:p>
+        </w:tc>
+        <w:tc>
+          <w:tcPr>
+            <w:tcW w:type="dxa" w:w="2340"/>
+            <w:shd w:fill="FFFFFF"/>
+            <w:tcMar>
+              <w:top w:w="70" w:type="dxa"/>
+              <w:bottom w:w="70" w:type="dxa"/>
+              <w:left w:w="70" w:type="dxa"/>
+              <w:right w:w="70" w:type="dxa"/>
+            </w:tcMar>
+          </w:tcPr>
+          <w:p>
+            <w:r>
+              <w:rPr>
+                <w:rFonts w:ascii="Calibri" w:hAnsi="Calibri"/>
+                <w:color w:val="1E293B"/>
+                <w:sz w:val="17"/>
+              </w:rPr>
+              <w:t>Local PostgreSQL 16 + PgBouncer</w:t>
+            </w:r>
+          </w:p>
+        </w:tc>
+        <w:tc>
+          <w:tcPr>
+            <w:tcW w:type="dxa" w:w="2340"/>
+            <w:shd w:fill="FFFFFF"/>
+            <w:tcMar>
+              <w:top w:w="70" w:type="dxa"/>
+              <w:bottom w:w="70" w:type="dxa"/>
+              <w:left w:w="70" w:type="dxa"/>
+              <w:right w:w="70" w:type="dxa"/>
+            </w:tcMar>
+          </w:tcPr>
+          <w:p>
+            <w:r>
+              <w:rPr>
+                <w:rFonts w:ascii="Calibri" w:hAnsi="Calibri"/>
+                <w:color w:val="1E293B"/>
+                <w:sz w:val="17"/>
+              </w:rPr>
+              <w:t>Ideal for complete internal campus control using Docker and PM2 reverse-proxied by Nginx.</w:t>
+            </w:r>
+          </w:p>
+        </w:tc>
+      </w:tr>
+      <w:tr>
+        <w:tc>
+          <w:tcPr>
+            <w:tcW w:type="dxa" w:w="2340"/>
+            <w:shd w:fill="F8FAFC"/>
+            <w:tcMar>
+              <w:top w:w="70" w:type="dxa"/>
+              <w:bottom w:w="70" w:type="dxa"/>
+              <w:left w:w="70" w:type="dxa"/>
+              <w:right w:w="70" w:type="dxa"/>
+            </w:tcMar>
+          </w:tcPr>
+          <w:p>
+            <w:r>
+              <w:rPr>
+                <w:rFonts w:ascii="Calibri" w:hAnsi="Calibri"/>
+                <w:color w:val="1E293B"/>
+                <w:sz w:val="17"/>
+              </w:rPr>
+              <w:t>Supabase (DB)</w:t>
+            </w:r>
+          </w:p>
+        </w:tc>
+        <w:tc>
+          <w:tcPr>
+            <w:tcW w:type="dxa" w:w="2340"/>
+            <w:shd w:fill="F8FAFC"/>
+            <w:tcMar>
+              <w:top w:w="70" w:type="dxa"/>
+              <w:bottom w:w="70" w:type="dxa"/>
+              <w:left w:w="70" w:type="dxa"/>
+              <w:right w:w="70" w:type="dxa"/>
+            </w:tcMar>
+          </w:tcPr>
+          <w:p>
+            <w:r>
+              <w:rPr>
+                <w:rFonts w:ascii="Calibri" w:hAnsi="Calibri"/>
+                <w:color w:val="1E293B"/>
+                <w:sz w:val="17"/>
+              </w:rPr>
+              <w:t>Free Tier (500MB DB storage)</w:t>
+            </w:r>
+          </w:p>
+        </w:tc>
+        <w:tc>
+          <w:tcPr>
+            <w:tcW w:type="dxa" w:w="2340"/>
+            <w:shd w:fill="F8FAFC"/>
+            <w:tcMar>
+              <w:top w:w="70" w:type="dxa"/>
+              <w:bottom w:w="70" w:type="dxa"/>
+              <w:left w:w="70" w:type="dxa"/>
+              <w:right w:w="70" w:type="dxa"/>
+            </w:tcMar>
+          </w:tcPr>
+          <w:p>
+            <w:r>
+              <w:rPr>
+                <w:rFonts w:ascii="Calibri" w:hAnsi="Calibri"/>
+                <w:color w:val="1E293B"/>
+                <w:sz w:val="17"/>
+              </w:rPr>
+              <w:t>Native PostgreSQL + Connection Pooler</w:t>
+            </w:r>
+          </w:p>
+        </w:tc>
+        <w:tc>
+          <w:tcPr>
+            <w:tcW w:type="dxa" w:w="2340"/>
+            <w:shd w:fill="F8FAFC"/>
+            <w:tcMar>
+              <w:top w:w="70" w:type="dxa"/>
+              <w:bottom w:w="70" w:type="dxa"/>
+              <w:left w:w="70" w:type="dxa"/>
+              <w:right w:w="70" w:type="dxa"/>
+            </w:tcMar>
+          </w:tcPr>
+          <w:p>
+            <w:r>
+              <w:rPr>
+                <w:rFonts w:ascii="Calibri" w:hAnsi="Calibri"/>
+                <w:color w:val="1E293B"/>
+                <w:sz w:val="17"/>
+              </w:rPr>
+              <w:t>Ideal free DB for 100-day marathon; handles 50k monthly active users effortlessly.</w:t>
+            </w:r>
+          </w:p>
+        </w:tc>
+      </w:tr>
+    </w:tbl>
+    <w:p>
+      <w:pPr>
+        <w:spacing w:after="120"/>
+      </w:pPr>
+    </w:p>
+    <w:p>
+      <w:pPr>
+        <w:keepNext/>
+        <w:spacing w:before="240" w:after="40"/>
+      </w:pPr>
+      <w:r>
+        <w:rPr>
+          <w:rFonts w:ascii="Calibri" w:hAnsi="Calibri"/>
+          <w:b/>
+          <w:color w:val="9E1B32"/>
+          <w:sz w:val="24"/>
+        </w:rPr>
+        <w:t>C. Step-by-Step Free Deployment Runbook</w:t>
       </w:r>
     </w:p>
     <w:p>
@@ -3188,7 +3918,7 @@
           <w:color w:val="1E293B"/>
           <w:sz w:val="20"/>
         </w:rPr>
-        <w:t>5. Production Build:</w:t>
+        <w:t>Step 1 (Source Code):</w:t>
       </w:r>
       <w:r>
         <w:rPr>
@@ -3196,7 +3926,183 @@
           <w:color w:val="1E293B"/>
           <w:sz w:val="20"/>
         </w:rPr>
-        <w:t>Run `npm run build` followed by `npm run start` (or host via PM2 / Docker) to launch the high-performance production server.</w:t>
+        <w:t>1. Push repository code to GitHub.</w:t>
+      </w:r>
+    </w:p>
+    <w:p>
+      <w:pPr>
+        <w:pStyle w:val="ListBullet"/>
+        <w:spacing w:after="60" w:line="276" w:lineRule="auto"/>
+      </w:pPr>
+      <w:r>
+        <w:rPr>
+          <w:rFonts w:ascii="Calibri" w:hAnsi="Calibri"/>
+          <w:b/>
+          <w:color w:val="1E293B"/>
+          <w:sz w:val="20"/>
+        </w:rPr>
+        <w:t>Step 2 (Database Provisioning):</w:t>
+      </w:r>
+      <w:r>
+        <w:rPr>
+          <w:rFonts w:ascii="Calibri" w:hAnsi="Calibri"/>
+          <w:color w:val="1E293B"/>
+          <w:sz w:val="20"/>
+        </w:rPr>
+        <w:t>2. Create a free project on Supabase in South Asia (Mumbai) and copy the pooled connection string (port 6543).</w:t>
+      </w:r>
+    </w:p>
+    <w:p>
+      <w:pPr>
+        <w:pStyle w:val="ListBullet"/>
+        <w:spacing w:after="60" w:line="276" w:lineRule="auto"/>
+      </w:pPr>
+      <w:r>
+        <w:rPr>
+          <w:rFonts w:ascii="Calibri" w:hAnsi="Calibri"/>
+          <w:b/>
+          <w:color w:val="1E293B"/>
+          <w:sz w:val="20"/>
+        </w:rPr>
+        <w:t>Step 3 (Schema Adjustment):</w:t>
+      </w:r>
+      <w:r>
+        <w:rPr>
+          <w:rFonts w:ascii="Calibri" w:hAnsi="Calibri"/>
+          <w:color w:val="1E293B"/>
+          <w:sz w:val="20"/>
+        </w:rPr>
+        <w:t>3. Change datasource in prisma/schema.prisma to 'postgresql'.</w:t>
+      </w:r>
+    </w:p>
+    <w:p>
+      <w:pPr>
+        <w:pStyle w:val="ListBullet"/>
+        <w:spacing w:after="60" w:line="276" w:lineRule="auto"/>
+      </w:pPr>
+      <w:r>
+        <w:rPr>
+          <w:rFonts w:ascii="Calibri" w:hAnsi="Calibri"/>
+          <w:b/>
+          <w:color w:val="1E293B"/>
+          <w:sz w:val="20"/>
+        </w:rPr>
+        <w:t>Step 4 (Database Initialization):</w:t>
+      </w:r>
+      <w:r>
+        <w:rPr>
+          <w:rFonts w:ascii="Calibri" w:hAnsi="Calibri"/>
+          <w:color w:val="1E293B"/>
+          <w:sz w:val="20"/>
+        </w:rPr>
+        <w:t>4. Run `npx prisma db push` to create tables, then execute `npx tsx prisma/seed.ts` to populate the 100 DSA challenges.</w:t>
+      </w:r>
+    </w:p>
+    <w:p>
+      <w:pPr>
+        <w:pStyle w:val="ListBullet"/>
+        <w:spacing w:after="60" w:line="276" w:lineRule="auto"/>
+      </w:pPr>
+      <w:r>
+        <w:rPr>
+          <w:rFonts w:ascii="Calibri" w:hAnsi="Calibri"/>
+          <w:b/>
+          <w:color w:val="1E293B"/>
+          <w:sz w:val="20"/>
+        </w:rPr>
+        <w:t>Step 5 (Production Build):</w:t>
+      </w:r>
+      <w:r>
+        <w:rPr>
+          <w:rFonts w:ascii="Calibri" w:hAnsi="Calibri"/>
+          <w:color w:val="1E293B"/>
+          <w:sz w:val="20"/>
+        </w:rPr>
+        <w:t>5. Import repository into Vercel, configure DATABASE_URL, AUTH_SECRET, and NEXT_PUBLIC_APP_URL, and click Deploy.</w:t>
+      </w:r>
+    </w:p>
+    <w:p>
+      <w:pPr>
+        <w:pStyle w:val="ListBullet"/>
+        <w:spacing w:after="60" w:line="276" w:lineRule="auto"/>
+      </w:pPr>
+      <w:r>
+        <w:rPr>
+          <w:rFonts w:ascii="Calibri" w:hAnsi="Calibri"/>
+          <w:b/>
+          <w:color w:val="1E293B"/>
+          <w:sz w:val="20"/>
+        </w:rPr>
+        <w:t>Step 6 (Domain Binding):</w:t>
+      </w:r>
+      <w:r>
+        <w:rPr>
+          <w:rFonts w:ascii="Calibri" w:hAnsi="Calibri"/>
+          <w:color w:val="1E293B"/>
+          <w:sz w:val="20"/>
+        </w:rPr>
+        <w:t>6. Under Project Settings -&gt; Domains, connect code100.vercel.app or add a CNAME record for code100.gat.ac.in.</w:t>
+      </w:r>
+    </w:p>
+    <w:p>
+      <w:pPr>
+        <w:keepNext/>
+        <w:spacing w:before="240" w:after="40"/>
+      </w:pPr>
+      <w:r>
+        <w:rPr>
+          <w:rFonts w:ascii="Calibri" w:hAnsi="Calibri"/>
+          <w:b/>
+          <w:color w:val="9E1B32"/>
+          <w:sz w:val="24"/>
+        </w:rPr>
+        <w:t>D. Disaster Recovery &amp; Emergency Fallback</w:t>
+      </w:r>
+    </w:p>
+    <w:p>
+      <w:pPr>
+        <w:pStyle w:val="ListBullet"/>
+        <w:spacing w:after="60" w:line="276" w:lineRule="auto"/>
+      </w:pPr>
+      <w:r>
+        <w:rPr>
+          <w:rFonts w:ascii="Calibri" w:hAnsi="Calibri"/>
+          <w:b/>
+          <w:color w:val="1E293B"/>
+          <w:sz w:val="20"/>
+        </w:rPr>
+        <w:t>Outage Contingency:</w:t>
+      </w:r>
+      <w:r>
+        <w:rPr>
+          <w:rFonts w:ascii="Calibri" w:hAnsi="Calibri"/>
+          <w:color w:val="1E293B"/>
+          <w:sz w:val="20"/>
+        </w:rPr>
+        <w:t>If the primary web service suffers an outage, an emergency Google Form is activated for students to record their solution URLs and timestamps without losing streak continuity.</w:t>
+      </w:r>
+    </w:p>
+    <w:p>
+      <w:pPr>
+        <w:pStyle w:val="ListBullet"/>
+        <w:spacing w:after="60" w:line="276" w:lineRule="auto"/>
+      </w:pPr>
+      <w:r>
+        <w:rPr>
+          <w:rFonts w:ascii="Calibri" w:hAnsi="Calibri"/>
+          <w:b/>
+          <w:color w:val="1E293B"/>
+          <w:sz w:val="20"/>
+        </w:rPr>
+        <w:t>Backup Strategy:</w:t>
+      </w:r>
+      <w:r>
+        <w:rPr>
+          <w:rFonts w:ascii="Calibri" w:hAnsi="Calibri"/>
+          <w:color w:val="1E293B"/>
+          <w:sz w:val="20"/>
+        </w:rPr>
+        <w:t>Nightly automated pg_dump backups preserve student submissions, streaks, and audit history.</w:t>
       </w:r>
     </w:p>
     <w:p>
@@ -3282,6 +4188,63 @@
         </w:rPr>
         <w:t>`student@gat.ac.in` | Password: `student@gat2026`</w:t>
       </w:r>
+    </w:p>
+    <w:tbl>
+      <w:tblPr>
+        <w:tblW w:type="auto" w:w="0"/>
+        <w:jc w:val="center"/>
+        <w:tblLook w:firstColumn="1" w:firstRow="1" w:lastColumn="0" w:lastRow="0" w:noHBand="0" w:noVBand="1" w:val="04A0"/>
+      </w:tblPr>
+      <w:tblGrid>
+        <w:gridCol w:w="9360"/>
+      </w:tblGrid>
+      <w:tr>
+        <w:tc>
+          <w:tcPr>
+            <w:tcW w:type="dxa" w:w="9360"/>
+            <w:shd w:fill="F8FAFC"/>
+            <w:tcMar>
+              <w:top w:w="140" w:type="dxa"/>
+              <w:bottom w:w="140" w:type="dxa"/>
+              <w:left w:w="200" w:type="dxa"/>
+              <w:right w:w="200" w:type="dxa"/>
+            </w:tcMar>
+            <w:tcBorders>
+              <w:top w:val="none"/>
+              <w:left w:val="single" w:sz="24" w:space="0" w:color="9E1B32"/>
+              <w:bottom w:val="none"/>
+              <w:right w:val="none"/>
+            </w:tcBorders>
+          </w:tcPr>
+          <w:p>
+            <w:pPr>
+              <w:spacing w:before="40" w:after="40"/>
+            </w:pPr>
+            <w:r>
+              <w:rPr>
+                <w:rFonts w:ascii="Calibri" w:hAnsi="Calibri"/>
+                <w:b/>
+                <w:color w:val="9E1B32"/>
+                <w:sz w:val="20"/>
+              </w:rPr>
+              <w:t xml:space="preserve">PROJECT ATTRIBUTION: </w:t>
+            </w:r>
+            <w:r>
+              <w:rPr>
+                <w:rFonts w:ascii="Calibri" w:hAnsi="Calibri"/>
+                <w:color w:val="1E293B"/>
+                <w:sz w:val="20"/>
+              </w:rPr>
+              <w:t>CODE100 Platform was conceptualized, designed, and built by GAT ACM STUDENT CHAPTER for the student community of Global Academy of Technology.</w:t>
+            </w:r>
+          </w:p>
+        </w:tc>
+      </w:tr>
+    </w:tbl>
+    <w:p>
+      <w:pPr>
+        <w:spacing w:after="80"/>
+      </w:pPr>
     </w:p>
     <w:sectPr>
       <w:pgSz w:w="12240" w:h="15840"/>

</xml_diff>